<commit_message>
Finalize starter task documentation
</commit_message>
<xml_diff>
--- a/docs/elt_bench_tinker_design.docx
+++ b/docs/elt_bench_tinker_design.docx
@@ -7,12 +7,23 @@
         <w:pStyle w:val="Title"/>
       </w:pPr>
       <w:r>
-        <w:t>ELT Bench with Tinker</w:t>
+        <w:t>ELT Bench Starter Task</w:t>
+      </w:r>
+    </w:p>
+    <w:p>
+      <w:pPr>
+        <w:pStyle w:val="Heading1"/>
+      </w:pPr>
+      <w:r>
+        <w:rPr>
+          <w:sz w:val="28"/>
+        </w:rPr>
+        <w:t>Selected task Trains</w:t>
       </w:r>
     </w:p>
     <w:p>
       <w:r>
-        <w:t>We implement an execution-verified recipe for the official ELT-Bench trains task. ELT-Bench supplies 20 train CSV records, 63 car records, target requirements and a reference comparator.</w:t>
+        <w:t>For the official ELT-Bench trains task, combine 20 train CSV records and 63 car records into one row per train. Compute direction, car-count flags, double-sided third-car and rectangular head-car flags, and the number of open-roof cars.</w:t>
       </w:r>
     </w:p>
     <w:p>
@@ -303,8 +314,11 @@
       </w:tr>
     </w:tbl>
     <w:p>
+      <w:pPr>
+        <w:spacing w:before="80"/>
+      </w:pPr>
       <w:r>
-        <w:t>The car connector reads official data through a local HTTP replay endpoint; load writes the sources to Snowflake. Episodes retain messages and tables for up to 14 actions or 16,000 generated tokens. Credentials and reference answers stay outside model access.</w:t>
+        <w:t>Official car data are served through a local HTTP replay endpoint and loaded into Snowflake. Each rollout has an isolated namespace and up to 14 actions.</w:t>
       </w:r>
     </w:p>
     <w:p>
@@ -312,25 +326,43 @@
         <w:pStyle w:val="Heading1"/>
       </w:pPr>
       <w:r>
-        <w:t>Model and reward</w:t>
-      </w:r>
-    </w:p>
-    <w:p>
-      <w:r>
-        <w:t>Tinker provides inference and rank-16 LoRA training for Qwen/Qwen3.6-35B-A3B. Tinker Cookbook provides rendering, rollouts, centered advantages and training batches.</w:t>
+        <w:t>Training method</w:t>
       </w:r>
     </w:p>
     <w:p>
       <w:r>
         <w:rPr>
           <w:b/>
+          <w:sz w:val="24"/>
         </w:rPr>
-        <w:t>Submission reward: R = 0.8 A + 0.2 B if valid; otherwise 0.</w:t>
+        <w:t>Group-centered policy gradients with importance sampling and Adam.</w:t>
       </w:r>
     </w:p>
     <w:p>
       <w:r>
-        <w:t>A is the mean correct-cell proportion across six target fields, aligned by train_id. A wholly wrong field scores 0; a wholly correct field scores 1. Missing fields score 0; extra fields reduce A. B is 1 only when the complete output passes official comparison with the exact schema; otherwise 0.</w:t>
+        <w:t>We train Qwen/Qwen3.6-35B-A3B with rank-16 LoRA through Tinker. Tinker Cookbook supplies rendering, rollouts, advantage centering and batch assembly.</w:t>
+      </w:r>
+    </w:p>
+    <w:p>
+      <w:pPr>
+        <w:pStyle w:val="Heading1"/>
+      </w:pPr>
+      <w:r>
+        <w:t>Reward function</w:t>
+      </w:r>
+    </w:p>
+    <w:p>
+      <w:r>
+        <w:rPr>
+          <w:b/>
+          <w:sz w:val="32"/>
+        </w:rPr>
+        <w:t>R = 0.8 A + 0.2 B</w:t>
+      </w:r>
+    </w:p>
+    <w:p>
+      <w:r>
+        <w:t>A is the mean correct-cell proportion across six target fields, aligned by train_id. Missing fields score 0; extra fields reduce A. B is 1 only when the complete output passes official comparison with the exact schema; otherwise 0. Invalid submissions score 0.</w:t>
       </w:r>
     </w:p>
     <w:p>
@@ -348,7 +380,7 @@
     </w:p>
     <w:p>
       <w:r>
-        <w:t>Two updates use four fresh training rollouts each: eight training rollouts. Before and after training, four rollouts use the same evaluation seeds, separate from training: eight evaluation rollouts, 16 total. Only training rollouts update the model, using importance-sampling loss and Adam at learning rate 1e-5. Training/evaluation temperatures are 0.8/0.3; prompt/tool tokens are masked.</w:t>
+        <w:t>Two updates use four training rollouts each. Four evaluations before and four after training share the same seeds, separate from training: 16 rollouts total. Learning rate: 1e-5. Training/evaluation temperatures: 0.8/0.3.</w:t>
       </w:r>
     </w:p>
     <w:tbl>
@@ -605,8 +637,11 @@
       </w:tr>
     </w:tbl>
     <w:p>
+      <w:pPr>
+        <w:spacing w:before="80"/>
+      </w:pPr>
       <w:r>
-        <w:t>No training gain was observed. One trained-policy rollout exhausted its action limit without submitting. All 16 trajectories and both update receipts are retained; there are no intermediate evaluations or replacement samples.</w:t>
+        <w:t>No training gain was observed. All 16 trajectories and both update receipts are retained.</w:t>
       </w:r>
     </w:p>
     <w:p>
@@ -614,7 +649,7 @@
         <w:pStyle w:val="Heading1"/>
       </w:pPr>
       <w:r>
-        <w:t>Reflections</w:t>
+        <w:t>Limitations and Possible Explanations</w:t>
       </w:r>
     </w:p>
     <w:p>
@@ -622,7 +657,13 @@
         <w:pStyle w:val="ListBullet"/>
       </w:pPr>
       <w:r>
-        <w:t>Outcome-only feedback applies one trajectory advantage to every generated token. Without process rewards, successful trajectories can also reinforce incorrect attempts and redundant queries.</w:t>
+        <w:rPr>
+          <w:b/>
+        </w:rPr>
+        <w:t>Only final outcomes are rewarded.</w:t>
+      </w:r>
+      <w:r>
+        <w:t xml:space="preserve"> Useful actions and wrong turns share one trajectory advantage.</w:t>
       </w:r>
     </w:p>
     <w:p>
@@ -630,12 +671,32 @@
         <w:pStyle w:val="ListBullet"/>
       </w:pPr>
       <w:r>
-        <w:t>Four rollouts per update provide noisy training signals. Four evaluations per policy are also too few to establish a reliable performance change or generalization.</w:t>
+        <w:rPr>
+          <w:b/>
+        </w:rPr>
+        <w:t>Rollout groups are small.</w:t>
+      </w:r>
+      <w:r>
+        <w:t xml:space="preserve"> Four samples per update and four evaluations per policy limit reliability.</w:t>
+      </w:r>
+    </w:p>
+    <w:p>
+      <w:pPr>
+        <w:pStyle w:val="ListBullet"/>
+      </w:pPr>
+      <w:r>
+        <w:rPr>
+          <w:b/>
+        </w:rPr>
+        <w:t>LoRA updates may alter prior reasoning behavior.</w:t>
+      </w:r>
+      <w:r>
+        <w:t xml:space="preserve"> Broader evaluations are needed to test whether general reasoning was affected.</w:t>
       </w:r>
     </w:p>
     <w:p>
       <w:r>
-        <w:t>Credential-free integration tests pass; official Snowflake rollouts and two Tinker optimization steps are recorded in the repository.</w:t>
+        <w:t>Local integration tests pass; cloud rollout and training evidence are retained.</w:t>
       </w:r>
     </w:p>
     <w:p>
@@ -1088,7 +1149,7 @@
       <w:b/>
       <w:bCs/>
       <w:color w:val="000000"/>
-      <w:sz w:val="23"/>
+      <w:sz w:val="26"/>
       <w:szCs w:val="28"/>
     </w:rPr>
   </w:style>

</xml_diff>